<commit_message>
Update Decision Authority Map: cost allocation and part shortage escalation
- Operations Manager: 'job allocation' → 'job cost allocation'
- Production Supervisors: part shortage escalates to Production Manager
  (job continues unless critical); package stops remain mandatory

Co-Authored-By: Claude Sonnet 4.6 <noreply@anthropic.com>
Claude-Session: https://claude.ai/code/session_01FujGE9vvBG8EQRodGbb5XZ
</commit_message>
<xml_diff>
--- a/Decision-Authority-Map.docx
+++ b/Decision-Authority-Map.docx
@@ -529,7 +529,7 @@
                 <w:color w:val="1E6B45"/>
                 <w:sz w:val="15"/>
               </w:rPr>
-              <w:t>· Job allocation decisions within capacity</w:t>
+              <w:t>· Job cost allocation decisions within capacity</w:t>
             </w:r>
           </w:p>
           <w:p>
@@ -996,7 +996,7 @@
                 <w:color w:val="1E6B45"/>
                 <w:sz w:val="15"/>
               </w:rPr>
-              <w:t>· Stop a job for an incomplete or incorrect package</w:t>
+              <w:t>· Stop a job for an incomplete or incorrect engineering package</w:t>
             </w:r>
           </w:p>
           <w:p>
@@ -1028,7 +1028,7 @@
                 <w:color w:val="795500"/>
                 <w:sz w:val="15"/>
               </w:rPr>
-              <w:t>· No consultation required — act immediately</w:t>
+              <w:t>· No consultation required on package stops — act immediately</w:t>
             </w:r>
           </w:p>
         </w:tc>
@@ -1047,7 +1047,20 @@
                 <w:color w:val="991010"/>
                 <w:sz w:val="15"/>
               </w:rPr>
-              <w:t>· Production Manager — inform immediately when a job is stopped</w:t>
+              <w:t>· Production Manager — part shortage identified (job continues</w:t>
+            </w:r>
+          </w:p>
+          <w:p>
+            <w:pPr>
+              <w:spacing w:before="0" w:after="20"/>
+              <w:ind w:left="72"/>
+            </w:pPr>
+            <w:r>
+              <w:rPr>
+                <w:color w:val="1A202C"/>
+                <w:sz w:val="15"/>
+              </w:rPr>
+              <w:t xml:space="preserve">  unless critical; document: job, parts missing, ETA)</w:t>
             </w:r>
           </w:p>
           <w:p>
@@ -1060,7 +1073,7 @@
                 <w:color w:val="991010"/>
                 <w:sz w:val="15"/>
               </w:rPr>
-              <w:t>· Document: job number, reason, time, what is missing</w:t>
+              <w:t>· Production Manager — inform immediately when a job is stopped</w:t>
             </w:r>
           </w:p>
         </w:tc>

</xml_diff>

<commit_message>
Update Decision Authority Map with reviewed changes
- CEO → MD throughout all roles
- Engineering Manager: escalation paths via Aviation GM and MD
- Operations Manager: consult references Production GM/Manager and GK
- Production Manager: incomplete package escalation moved to Consult
- Production Supervisors: simplified to prioritisation and conflict escalation
- Quality Manager: escalate includes Aviation GM
- Aviation GM: customer relationship risk added to escalate

Co-Authored-By: Claude Sonnet 4.6 <noreply@anthropic.com>
Claude-Session: https://claude.ai/code/session_01FujGE9vvBG8EQRodGbb5XZ
</commit_message>
<xml_diff>
--- a/Decision-Authority-Map.docx
+++ b/Decision-Authority-Map.docx
@@ -334,7 +334,7 @@
                 <w:color w:val="795500"/>
                 <w:sz w:val="15"/>
               </w:rPr>
-              <w:t>· Production GM — design changes after release</w:t>
+              <w:t>· Production/ Aviation GM — design changes after release</w:t>
             </w:r>
           </w:p>
           <w:p>
@@ -347,7 +347,7 @@
                 <w:color w:val="795500"/>
                 <w:sz w:val="15"/>
               </w:rPr>
-              <w:t>· Production GM — before flagging a capacity constraint</w:t>
+              <w:t>· Aviation GM — before flagging a capacity constraint</w:t>
             </w:r>
           </w:p>
         </w:tc>
@@ -366,7 +366,7 @@
                 <w:color w:val="991010"/>
                 <w:sz w:val="15"/>
               </w:rPr>
-              <w:t>· Production GM — capacity constraint affecting schedule</w:t>
+              <w:t>· Aviation GM/ MD — capacity constraint affecting schedule</w:t>
             </w:r>
           </w:p>
           <w:p>
@@ -379,7 +379,20 @@
                 <w:color w:val="991010"/>
                 <w:sz w:val="15"/>
               </w:rPr>
-              <w:t>· CEO — design change with significant cost or delivery impact</w:t>
+              <w:t>· Aviation GM/ MD — customer delivery commitment at risk</w:t>
+            </w:r>
+          </w:p>
+          <w:p>
+            <w:pPr>
+              <w:spacing w:before="0" w:after="20"/>
+              <w:ind w:left="72"/>
+            </w:pPr>
+            <w:r>
+              <w:rPr>
+                <w:color w:val="991010"/>
+                <w:sz w:val="15"/>
+              </w:rPr>
+              <w:t>· MD — design change with significant cost or delivery impact</w:t>
             </w:r>
           </w:p>
         </w:tc>
@@ -561,7 +574,7 @@
                 <w:color w:val="795500"/>
                 <w:sz w:val="15"/>
               </w:rPr>
-              <w:t>· Engineering Manager — upstream information requirements</w:t>
+              <w:t>· Production GM/ Manager — upstream information requirements</w:t>
             </w:r>
           </w:p>
           <w:p>
@@ -574,7 +587,7 @@
                 <w:color w:val="795500"/>
                 <w:sz w:val="15"/>
               </w:rPr>
-              <w:t>· Finance Manager — systems investment scope</w:t>
+              <w:t>· GK — systems investment scope</w:t>
             </w:r>
           </w:p>
         </w:tc>
@@ -593,7 +606,7 @@
                 <w:color w:val="991010"/>
                 <w:sz w:val="15"/>
               </w:rPr>
-              <w:t>· Production GM — resourcing constraint beyond authority</w:t>
+              <w:t>· GK — resourcing constraint beyond authority</w:t>
             </w:r>
           </w:p>
           <w:p>
@@ -606,7 +619,7 @@
                 <w:color w:val="991010"/>
                 <w:sz w:val="15"/>
               </w:rPr>
-              <w:t>· CEO — systems spend approval</w:t>
+              <w:t>· MD — systems spend approval</w:t>
             </w:r>
           </w:p>
         </w:tc>
@@ -713,7 +726,7 @@
                 <w:color w:val="991010"/>
                 <w:sz w:val="15"/>
               </w:rPr>
-              <w:t>· CEO — systems spend approval</w:t>
+              <w:t>· MD — systems spend approval</w:t>
             </w:r>
           </w:p>
           <w:p>
@@ -726,7 +739,7 @@
                 <w:color w:val="991010"/>
                 <w:sz w:val="15"/>
               </w:rPr>
-              <w:t>· CEO — material margin risk or cash risk above threshold</w:t>
+              <w:t>· MD — material margin risk or cash risk above threshold</w:t>
             </w:r>
           </w:p>
         </w:tc>
@@ -814,7 +827,7 @@
                 <w:color w:val="795500"/>
                 <w:sz w:val="15"/>
               </w:rPr>
-              <w:t>· Finance Manager — significant overtime cost impact</w:t>
+              <w:t>· MD/ Finance Manager — significant overtime cost impact</w:t>
             </w:r>
           </w:p>
         </w:tc>
@@ -833,7 +846,7 @@
                 <w:color w:val="991010"/>
                 <w:sz w:val="15"/>
               </w:rPr>
-              <w:t>· CEO — capital or headcount required</w:t>
+              <w:t>· MD — capital or headcount required</w:t>
             </w:r>
           </w:p>
           <w:p>
@@ -846,7 +859,7 @@
                 <w:color w:val="991010"/>
                 <w:sz w:val="15"/>
               </w:rPr>
-              <w:t>· CEO — customer delivery commitment at risk</w:t>
+              <w:t>· MD — customer delivery commitment at risk</w:t>
             </w:r>
           </w:p>
         </w:tc>
@@ -924,6 +937,19 @@
               <w:t>· Production GM — resource conflict between cells</w:t>
             </w:r>
           </w:p>
+          <w:p>
+            <w:pPr>
+              <w:spacing w:before="0" w:after="20"/>
+              <w:ind w:left="72"/>
+            </w:pPr>
+            <w:r>
+              <w:rPr>
+                <w:color w:val="795500"/>
+                <w:sz w:val="15"/>
+              </w:rPr>
+              <w:t>· Production GM — an incomplete or incorrect engineering package (mandatory)</w:t>
+            </w:r>
+          </w:p>
         </w:tc>
         <w:tc>
           <w:tcPr>
@@ -996,20 +1022,7 @@
                 <w:color w:val="1E6B45"/>
                 <w:sz w:val="15"/>
               </w:rPr>
-              <w:t>· Stop a job for an incomplete or incorrect engineering package</w:t>
-            </w:r>
-          </w:p>
-          <w:p>
-            <w:pPr>
-              <w:spacing w:before="0" w:after="20"/>
-              <w:ind w:left="72"/>
-            </w:pPr>
-            <w:r>
-              <w:rPr>
-                <w:color w:val="1A202C"/>
-                <w:sz w:val="15"/>
-              </w:rPr>
-              <w:t xml:space="preserve">  (mandatory — not optional)</w:t>
+              <w:t>· Day-to-day job prioritisation on the floor</w:t>
             </w:r>
           </w:p>
         </w:tc>
@@ -1028,7 +1041,7 @@
                 <w:color w:val="795500"/>
                 <w:sz w:val="15"/>
               </w:rPr>
-              <w:t>· No consultation required on package stops — act immediately</w:t>
+              <w:t>· Production Manager/ GM — resource conflict between cells</w:t>
             </w:r>
           </w:p>
         </w:tc>
@@ -1047,20 +1060,7 @@
                 <w:color w:val="991010"/>
                 <w:sz w:val="15"/>
               </w:rPr>
-              <w:t>· Production Manager — part shortage identified (job continues</w:t>
-            </w:r>
-          </w:p>
-          <w:p>
-            <w:pPr>
-              <w:spacing w:before="0" w:after="20"/>
-              <w:ind w:left="72"/>
-            </w:pPr>
-            <w:r>
-              <w:rPr>
-                <w:color w:val="1A202C"/>
-                <w:sz w:val="15"/>
-              </w:rPr>
-              <w:t xml:space="preserve">  unless critical; document: job, parts missing, ETA)</w:t>
+              <w:t>· Production Manager — inform immediately when a job is stopped</w:t>
             </w:r>
           </w:p>
           <w:p>
@@ -1073,7 +1073,7 @@
                 <w:color w:val="991010"/>
                 <w:sz w:val="15"/>
               </w:rPr>
-              <w:t>· Production Manager — inform immediately when a job is stopped</w:t>
+              <w:t>· Document: job number, reason, time, what is missing</w:t>
             </w:r>
           </w:p>
         </w:tc>
@@ -1180,7 +1180,7 @@
                 <w:color w:val="991010"/>
                 <w:sz w:val="15"/>
               </w:rPr>
-              <w:t>· CEO — customer-visible defect (mandatory, same day, every time)</w:t>
+              <w:t>· MD/ Aviation GM — customer-visible defect (mandatory, same day, every time)</w:t>
             </w:r>
           </w:p>
         </w:tc>
@@ -1274,7 +1274,7 @@
                 <w:color w:val="991010"/>
                 <w:sz w:val="15"/>
               </w:rPr>
-              <w:t>· CEO — recordable incident (mandatory, same day)</w:t>
+              <w:t>· MD — recordable incident (mandatory, same day)</w:t>
             </w:r>
           </w:p>
           <w:p>
@@ -1287,7 +1287,7 @@
                 <w:color w:val="991010"/>
                 <w:sz w:val="15"/>
               </w:rPr>
-              <w:t>· CEO — any regulatory reporting obligation (mandatory)</w:t>
+              <w:t>· MD — any regulatory reporting obligation (mandatory)</w:t>
             </w:r>
           </w:p>
         </w:tc>
@@ -1514,7 +1514,7 @@
                 <w:color w:val="991010"/>
                 <w:sz w:val="15"/>
               </w:rPr>
-              <w:t>· CEO — pricing above defined threshold</w:t>
+              <w:t>· MD — pricing above defined threshold</w:t>
             </w:r>
           </w:p>
           <w:p>
@@ -1527,7 +1527,7 @@
                 <w:color w:val="991010"/>
                 <w:sz w:val="15"/>
               </w:rPr>
-              <w:t>· CEO — customer relationship at material risk</w:t>
+              <w:t>· MD — customer relationship at material risk</w:t>
             </w:r>
           </w:p>
         </w:tc>
@@ -1634,7 +1634,7 @@
                 <w:color w:val="991010"/>
                 <w:sz w:val="15"/>
               </w:rPr>
-              <w:t>· CEO — aviation defect reaching customer (mandatory, same day)</w:t>
+              <w:t>· MD — aviation defect reaching customer (mandatory, same day)</w:t>
             </w:r>
           </w:p>
           <w:p>
@@ -1647,7 +1647,20 @@
                 <w:color w:val="991010"/>
                 <w:sz w:val="15"/>
               </w:rPr>
-              <w:t>· CEO — any decision with regulatory impact</w:t>
+              <w:t>· MD — any decision with regulatory impact</w:t>
+            </w:r>
+          </w:p>
+          <w:p>
+            <w:pPr>
+              <w:spacing w:before="0" w:after="20"/>
+              <w:ind w:left="72"/>
+            </w:pPr>
+            <w:r>
+              <w:rPr>
+                <w:color w:val="991010"/>
+                <w:sz w:val="15"/>
+              </w:rPr>
+              <w:t>· MD — customer relationship at material risk</w:t>
             </w:r>
           </w:p>
         </w:tc>
@@ -1754,7 +1767,7 @@
                 <w:color w:val="991010"/>
                 <w:sz w:val="15"/>
               </w:rPr>
-              <w:t>· CEO — supply chain at material risk</w:t>
+              <w:t>· MD — supply chain at material risk</w:t>
             </w:r>
           </w:p>
           <w:p>
@@ -1767,7 +1780,7 @@
                 <w:color w:val="991010"/>
                 <w:sz w:val="15"/>
               </w:rPr>
-              <w:t>· CEO — spend above defined threshold</w:t>
+              <w:t>· MD — spend above defined threshold</w:t>
             </w:r>
           </w:p>
         </w:tc>

</xml_diff>